<commit_message>
Add Windows environment check script references to complete guide
Pytesseract_Complete_Guide.docx に check_windows_environment.ps1 への
参照を追加しました（python-docx で自動更新）：

- 「2.1 Tesseract-OCRのインストール」配下に新しい見出し
  「Windows 事前環境チェック（推奨）」を追加し、実行方法と確認項目
  （Python / pip / 各パッケージ / Tesseract / 言語パック / Poppler 等）
  を記載
- 「7.1 トラブルシューティング - Tesseractが見つからない」の解決手順末尾に
  事前チェックスクリプトの案内を追加

https://claude.ai/code/session_01TDQJuEDddNNy6UybzPf1Ua
</commit_message>
<xml_diff>
--- a/Pytesseract_Complete_Guide.docx
+++ b/Pytesseract_Complete_Guide.docx
@@ -721,6 +721,103 @@
     <w:p/>
     <w:p>
       <w:pPr>
+        <w:pStyle w:val="Heading3"/>
+      </w:pPr>
+      <w:r>
+        <w:t>Windows 事前環境チェック（推奨）</w:t>
+      </w:r>
+    </w:p>
+    <w:p>
+      <w:pPr/>
+      <w:r>
+        <w:t>本プロジェクトには、Windows で必要なプログラム類のインストール状況をまとめて確認する PowerShell スクリプトが含まれています。</w:t>
+      </w:r>
+    </w:p>
+    <w:p>
+      <w:pPr/>
+      <w:r>
+        <w:t>実行方法（PowerShell）：</w:t>
+      </w:r>
+    </w:p>
+    <w:p>
+      <w:pPr/>
+      <w:r>
+        <w:t>powershell -ExecutionPolicy Bypass -File .\check_windows_environment.ps1</w:t>
+      </w:r>
+    </w:p>
+    <w:p>
+      <w:pPr/>
+      <w:r>
+        <w:t>確認内容：</w:t>
+      </w:r>
+    </w:p>
+    <w:p>
+      <w:pPr>
+        <w:pStyle w:val="ListBullet"/>
+      </w:pPr>
+      <w:r>
+        <w:t>確認日 / コンピュータ名 / ユーザー名</w:t>
+      </w:r>
+    </w:p>
+    <w:p>
+      <w:pPr>
+        <w:pStyle w:val="ListBullet"/>
+      </w:pPr>
+      <w:r>
+        <w:t>OS / PowerShell バージョン / 実行ポリシー</w:t>
+      </w:r>
+    </w:p>
+    <w:p>
+      <w:pPr>
+        <w:pStyle w:val="ListBullet"/>
+      </w:pPr>
+      <w:r>
+        <w:t>Python / pip のインストール状況とバージョン</w:t>
+      </w:r>
+    </w:p>
+    <w:p>
+      <w:pPr>
+        <w:pStyle w:val="ListBullet"/>
+      </w:pPr>
+      <w:r>
+        <w:t>Python パッケージ（pytesseract / Pillow / pdf2image）</w:t>
+      </w:r>
+    </w:p>
+    <w:p>
+      <w:pPr>
+        <w:pStyle w:val="ListBullet"/>
+      </w:pPr>
+      <w:r>
+        <w:t>Tesseract-OCR の実行ファイルパスと PATH 設定</w:t>
+      </w:r>
+    </w:p>
+    <w:p>
+      <w:pPr>
+        <w:pStyle w:val="ListBullet"/>
+      </w:pPr>
+      <w:r>
+        <w:t>言語パック（jpn.traineddata / eng.traineddata）の有無</w:t>
+      </w:r>
+    </w:p>
+    <w:p>
+      <w:pPr>
+        <w:pStyle w:val="ListBullet"/>
+      </w:pPr>
+      <w:r>
+        <w:t>Poppler（pdf2image が依存）の有無</w:t>
+      </w:r>
+    </w:p>
+    <w:p>
+      <w:pPr/>
+      <w:r>
+        <w:t>不足している項目には、インストール手順や入手先URLがヒントとして表示されます。</w:t>
+      </w:r>
+    </w:p>
+    <w:p>
+      <w:pPr/>
+    </w:p>
+    <w:p>
+      <w:pPr>
         <w:pStyle w:val="Heading2"/>
       </w:pPr>
       <w:r>
@@ -2621,6 +2718,27 @@
       </w:r>
     </w:p>
     <w:p/>
+    <w:p>
+      <w:pPr/>
+      <w:r>
+        <w:t>Windows ユーザー向け：環境チェックスクリプト</w:t>
+      </w:r>
+    </w:p>
+    <w:p>
+      <w:pPr/>
+      <w:r>
+        <w:t>本プロジェクトの check_windows_environment.ps1 を実行すると、Tesseract-OCR のインストール先や PATH 設定、Python パッケージの状態がまとめて確認できます。</w:t>
+      </w:r>
+    </w:p>
+    <w:p>
+      <w:pPr/>
+      <w:r>
+        <w:t>powershell -ExecutionPolicy Bypass -File .\check_windows_environment.ps1</w:t>
+      </w:r>
+    </w:p>
+    <w:p>
+      <w:pPr/>
+    </w:p>
     <w:p>
       <w:pPr>
         <w:pStyle w:val="Heading3"/>

</xml_diff>

<commit_message>
Add version display to all documents (v1.1.0)
各ドキュメントに以下の情報を追加しました：
- Version: v1.1.0
- Last Updated: 2026-05-22

更新対象：
- README.md
- pytesseract_cheatsheet.py
- pytesseract_sample_code.py
- setup_pytesseract.sh
- check_windows_environment.ps1
- Pytesseract_Complete_Guide.docx

https://claude.ai/code/session_01TDQJuEDddNNy6UybzPf1Ua
</commit_message>
<xml_diff>
--- a/Pytesseract_Complete_Guide.docx
+++ b/Pytesseract_Complete_Guide.docx
@@ -13,6 +13,16 @@
           <w:sz w:val="48"/>
         </w:rPr>
         <w:t>Pytesseract 完全ガイド</w:t>
+      </w:r>
+    </w:p>
+    <w:p>
+      <w:pPr/>
+      <w:r>
+        <w:rPr>
+          <w:color w:val="808080"/>
+          <w:sz w:val="18"/>
+        </w:rPr>
+        <w:t>Version: v1.1.0  |  Last Updated: 2026-05-22</w:t>
       </w:r>
     </w:p>
     <w:p>

</xml_diff>